<commit_message>
Instalación para Linux y GitHub: instalador, Codespaces y prueba de humo
- scripts/instalar.sh: instalación automática e idempotente (Python 3.10-3.13)
- scripts/prueba_humo.sh: arranca el gateway y lo verifica con solicitudes reales
- .devcontainer: GitHub Codespaces con Python 3.12 e instalación automática
- CI: usa el instalador, la prueba de humo y el reporte antes/después
- Makefile: instalar, verificar, iniciar/detener/estado; usa venv si existe
- Manual de instalación reescrito para Linux; manual de usuario alineado

Co-Authored-By: Claude Opus 5.5 <noreply@anthropic.com>
Claude-Session: https://claude.ai/code/session_017BULTufAgsUeH7bxarRoz6
</commit_message>
<xml_diff>
--- a/entregables/Manual_Usuario_Gateway_LLM.docx
+++ b/entregables/Manual_Usuario_Gateway_LLM.docx
@@ -42,7 +42,7 @@
     </w:p>
     <w:p>
       <w:r>
-        <w:t xml:space="preserve">Versión 1.0 · Octubre 2026 · Autor: César · Repositorio: </w:t>
+        <w:t xml:space="preserve">Versión 1.1 · Octubre 2026 · Autor: César · Repositorio: </w:t>
       </w:r>
       <w:r>
         <w:rPr>
@@ -1495,7 +1495,17 @@
         <w:t xml:space="preserve">dirección del gateway</w:t>
       </w:r>
       <w:r>
-        <w:t xml:space="preserve"> (en una instalación local, </w:t>
+        <w:t xml:space="preserve"> y su </w:t>
+      </w:r>
+      <w:r>
+        <w:rPr>
+          <w:b/>
+          <w:bCs/>
+        </w:rPr>
+        <w:t xml:space="preserve">clave de cliente</w:t>
+      </w:r>
+      <w:r>
+        <w:t xml:space="preserve">. La dirección es </w:t>
       </w:r>
       <w:r>
         <w:rPr>
@@ -1507,17 +1517,29 @@
         <w:t xml:space="preserve">http://localhost:8000</w:t>
       </w:r>
       <w:r>
-        <w:t xml:space="preserve">) y su </w:t>
+        <w:t xml:space="preserve"> desde la propia máquina Linux donde está instalado; en GitHub Codespaces, desde fuera, es la que muestra la pestaña </w:t>
       </w:r>
       <w:r>
         <w:rPr>
           <w:b/>
           <w:bCs/>
         </w:rPr>
-        <w:t xml:space="preserve">clave de cliente</w:t>
-      </w:r>
-      <w:r>
-        <w:t xml:space="preserve">.</w:t>
+        <w:t xml:space="preserve">PORTS</w:t>
+      </w:r>
+      <w:r>
+        <w:t xml:space="preserve"> (</w:t>
+      </w:r>
+      <w:r>
+        <w:rPr>
+          <w:rFonts w:ascii="Consolas" w:cs="Consolas" w:eastAsia="Consolas" w:hAnsi="Consolas"/>
+          <w:color w:val="8B1A1A"/>
+          <w:sz w:val="19"/>
+          <w:szCs w:val="19"/>
+        </w:rPr>
+        <w:t xml:space="preserve">https://NOMBRE-8000.app.github.dev</w:t>
+      </w:r>
+      <w:r>
+        <w:t xml:space="preserve">).</w:t>
       </w:r>
     </w:p>
     <w:p>
@@ -1551,7 +1573,7 @@
         <w:pStyle w:val="Heading2"/>
       </w:pPr>
       <w:r>
-        <w:t xml:space="preserve">3.1 Desde la terminal (Linux, macOS o Git Bash)</w:t>
+        <w:t xml:space="preserve">3.1 Desde la terminal</w:t>
       </w:r>
     </w:p>
     <w:tbl>
@@ -1598,7 +1620,7 @@
                 <w:sz w:val="16"/>
                 <w:szCs w:val="16"/>
               </w:rPr>
-              <w:t xml:space="preserve">export GW_KEY=gw_...su_clave...</w:t>
+              <w:t xml:space="preserve">export GW_KEY=gw_...su_clave...        # en la máquina de instalación: export GW_KEY=$(cat .gw_key)</w:t>
             </w:r>
           </w:p>
           <w:p>
@@ -1670,7 +1692,7 @@
         <w:pStyle w:val="Heading2"/>
       </w:pPr>
       <w:r>
-        <w:t xml:space="preserve">3.2 Desde PowerShell (Windows)</w:t>
+        <w:t xml:space="preserve">3.2 Desde Python</w:t>
       </w:r>
     </w:p>
     <w:tbl>
@@ -1717,7 +1739,7 @@
                 <w:sz w:val="16"/>
                 <w:szCs w:val="16"/>
               </w:rPr>
-              <w:t xml:space="preserve">$env:GW_KEY = "gw_...su_clave..."</w:t>
+              <w:t xml:space="preserve">import os</w:t>
             </w:r>
           </w:p>
           <w:p>
@@ -1731,7 +1753,7 @@
                 <w:sz w:val="16"/>
                 <w:szCs w:val="16"/>
               </w:rPr>
-              <w:t xml:space="preserve">$cabeceras = @{ Authorization = "Bearer $env:GW_KEY" }</w:t>
+              <w:t xml:space="preserve">import httpx</w:t>
             </w:r>
           </w:p>
           <w:p>
@@ -1745,7 +1767,7 @@
                 <w:sz w:val="16"/>
                 <w:szCs w:val="16"/>
               </w:rPr>
-              <w:t xml:space="preserve">$cuerpo = @{ mensaje = "¿Puedo devolver un producto que compré hace 20 días?" } | ConvertTo-Json</w:t>
+              <w:t xml:space="preserve"> </w:t>
             </w:r>
           </w:p>
           <w:p>
@@ -1759,7 +1781,7 @@
                 <w:sz w:val="16"/>
                 <w:szCs w:val="16"/>
               </w:rPr>
-              <w:t xml:space="preserve">Invoke-RestMethod -Uri http://localhost:8000/v1/chat -Method Post -Headers $cabeceras `</w:t>
+              <w:t xml:space="preserve">GATEWAY = os.getenv("GW_URL", "http://localhost:8000")</w:t>
             </w:r>
           </w:p>
           <w:p>
@@ -1773,7 +1795,203 @@
                 <w:sz w:val="16"/>
                 <w:szCs w:val="16"/>
               </w:rPr>
-              <w:t xml:space="preserve">  -ContentType "application/json; charset=utf-8" -Body ([Text.Encoding]::UTF8.GetBytes($cuerpo))</w:t>
+              <w:t xml:space="preserve">CLAVE = os.environ["GW_KEY"]          # nunca escriba la clave en el código</w:t>
+            </w:r>
+          </w:p>
+          <w:p>
+            <w:pPr>
+              <w:spacing w:after="0"/>
+            </w:pPr>
+            <w:r>
+              <w:rPr>
+                <w:rFonts w:ascii="Consolas" w:cs="Consolas" w:eastAsia="Consolas" w:hAnsi="Consolas"/>
+                <w:color w:val="1F1F1F"/>
+                <w:sz w:val="16"/>
+                <w:szCs w:val="16"/>
+              </w:rPr>
+              <w:t xml:space="preserve"> </w:t>
+            </w:r>
+          </w:p>
+          <w:p>
+            <w:pPr>
+              <w:spacing w:after="0"/>
+            </w:pPr>
+            <w:r>
+              <w:rPr>
+                <w:rFonts w:ascii="Consolas" w:cs="Consolas" w:eastAsia="Consolas" w:hAnsi="Consolas"/>
+                <w:color w:val="1F1F1F"/>
+                <w:sz w:val="16"/>
+                <w:szCs w:val="16"/>
+              </w:rPr>
+              <w:t xml:space="preserve">r = httpx.post(</w:t>
+            </w:r>
+          </w:p>
+          <w:p>
+            <w:pPr>
+              <w:spacing w:after="0"/>
+            </w:pPr>
+            <w:r>
+              <w:rPr>
+                <w:rFonts w:ascii="Consolas" w:cs="Consolas" w:eastAsia="Consolas" w:hAnsi="Consolas"/>
+                <w:color w:val="1F1F1F"/>
+                <w:sz w:val="16"/>
+                <w:szCs w:val="16"/>
+              </w:rPr>
+              <w:t xml:space="preserve">    f"{GATEWAY}/v1/chat",</w:t>
+            </w:r>
+          </w:p>
+          <w:p>
+            <w:pPr>
+              <w:spacing w:after="0"/>
+            </w:pPr>
+            <w:r>
+              <w:rPr>
+                <w:rFonts w:ascii="Consolas" w:cs="Consolas" w:eastAsia="Consolas" w:hAnsi="Consolas"/>
+                <w:color w:val="1F1F1F"/>
+                <w:sz w:val="16"/>
+                <w:szCs w:val="16"/>
+              </w:rPr>
+              <w:t xml:space="preserve">    headers={"Authorization": f"Bearer {CLAVE}"},</w:t>
+            </w:r>
+          </w:p>
+          <w:p>
+            <w:pPr>
+              <w:spacing w:after="0"/>
+            </w:pPr>
+            <w:r>
+              <w:rPr>
+                <w:rFonts w:ascii="Consolas" w:cs="Consolas" w:eastAsia="Consolas" w:hAnsi="Consolas"/>
+                <w:color w:val="1F1F1F"/>
+                <w:sz w:val="16"/>
+                <w:szCs w:val="16"/>
+              </w:rPr>
+              <w:t xml:space="preserve">    json={"mensaje": "¿Cuál es la política de devoluciones?", "max_tokens": 200},</w:t>
+            </w:r>
+          </w:p>
+          <w:p>
+            <w:pPr>
+              <w:spacing w:after="0"/>
+            </w:pPr>
+            <w:r>
+              <w:rPr>
+                <w:rFonts w:ascii="Consolas" w:cs="Consolas" w:eastAsia="Consolas" w:hAnsi="Consolas"/>
+                <w:color w:val="1F1F1F"/>
+                <w:sz w:val="16"/>
+                <w:szCs w:val="16"/>
+              </w:rPr>
+              <w:t xml:space="preserve">    timeout=30,</w:t>
+            </w:r>
+          </w:p>
+          <w:p>
+            <w:pPr>
+              <w:spacing w:after="0"/>
+            </w:pPr>
+            <w:r>
+              <w:rPr>
+                <w:rFonts w:ascii="Consolas" w:cs="Consolas" w:eastAsia="Consolas" w:hAnsi="Consolas"/>
+                <w:color w:val="1F1F1F"/>
+                <w:sz w:val="16"/>
+                <w:szCs w:val="16"/>
+              </w:rPr>
+              <w:t xml:space="preserve">)</w:t>
+            </w:r>
+          </w:p>
+          <w:p>
+            <w:pPr>
+              <w:spacing w:after="0"/>
+            </w:pPr>
+            <w:r>
+              <w:rPr>
+                <w:rFonts w:ascii="Consolas" w:cs="Consolas" w:eastAsia="Consolas" w:hAnsi="Consolas"/>
+                <w:color w:val="1F1F1F"/>
+                <w:sz w:val="16"/>
+                <w:szCs w:val="16"/>
+              </w:rPr>
+              <w:t xml:space="preserve">datos = r.json()</w:t>
+            </w:r>
+          </w:p>
+          <w:p>
+            <w:pPr>
+              <w:spacing w:after="0"/>
+            </w:pPr>
+            <w:r>
+              <w:rPr>
+                <w:rFonts w:ascii="Consolas" w:cs="Consolas" w:eastAsia="Consolas" w:hAnsi="Consolas"/>
+                <w:color w:val="1F1F1F"/>
+                <w:sz w:val="16"/>
+                <w:szCs w:val="16"/>
+              </w:rPr>
+              <w:t xml:space="preserve">if r.status_code == 200:</w:t>
+            </w:r>
+          </w:p>
+          <w:p>
+            <w:pPr>
+              <w:spacing w:after="0"/>
+            </w:pPr>
+            <w:r>
+              <w:rPr>
+                <w:rFonts w:ascii="Consolas" w:cs="Consolas" w:eastAsia="Consolas" w:hAnsi="Consolas"/>
+                <w:color w:val="1F1F1F"/>
+                <w:sz w:val="16"/>
+                <w:szCs w:val="16"/>
+              </w:rPr>
+              <w:t xml:space="preserve">    print(datos["respuesta"])</w:t>
+            </w:r>
+          </w:p>
+          <w:p>
+            <w:pPr>
+              <w:spacing w:after="0"/>
+            </w:pPr>
+            <w:r>
+              <w:rPr>
+                <w:rFonts w:ascii="Consolas" w:cs="Consolas" w:eastAsia="Consolas" w:hAnsi="Consolas"/>
+                <w:color w:val="1F1F1F"/>
+                <w:sz w:val="16"/>
+                <w:szCs w:val="16"/>
+              </w:rPr>
+              <w:t xml:space="preserve">elif r.status_code == 429:</w:t>
+            </w:r>
+          </w:p>
+          <w:p>
+            <w:pPr>
+              <w:spacing w:after="0"/>
+            </w:pPr>
+            <w:r>
+              <w:rPr>
+                <w:rFonts w:ascii="Consolas" w:cs="Consolas" w:eastAsia="Consolas" w:hAnsi="Consolas"/>
+                <w:color w:val="1F1F1F"/>
+                <w:sz w:val="16"/>
+                <w:szCs w:val="16"/>
+              </w:rPr>
+              <w:t xml:space="preserve">    print("Límite alcanzado; reintentar en", r.headers.get("Retry-After"), "segundos")</w:t>
+            </w:r>
+          </w:p>
+          <w:p>
+            <w:pPr>
+              <w:spacing w:after="0"/>
+            </w:pPr>
+            <w:r>
+              <w:rPr>
+                <w:rFonts w:ascii="Consolas" w:cs="Consolas" w:eastAsia="Consolas" w:hAnsi="Consolas"/>
+                <w:color w:val="1F1F1F"/>
+                <w:sz w:val="16"/>
+                <w:szCs w:val="16"/>
+              </w:rPr>
+              <w:t xml:space="preserve">else:</w:t>
+            </w:r>
+          </w:p>
+          <w:p>
+            <w:pPr>
+              <w:spacing w:after="0"/>
+            </w:pPr>
+            <w:r>
+              <w:rPr>
+                <w:rFonts w:ascii="Consolas" w:cs="Consolas" w:eastAsia="Consolas" w:hAnsi="Consolas"/>
+                <w:color w:val="1F1F1F"/>
+                <w:sz w:val="16"/>
+                <w:szCs w:val="16"/>
+              </w:rPr>
+              <w:t xml:space="preserve">    print(f"Error {r.status_code}: {datos['mensaje']} (request_id={datos['request_id']})")</w:t>
             </w:r>
           </w:p>
         </w:tc>
@@ -1789,327 +2007,12 @@
         <w:pStyle w:val="Heading2"/>
       </w:pPr>
       <w:r>
-        <w:t xml:space="preserve">3.3 Desde Python</w:t>
-      </w:r>
-    </w:p>
-    <w:tbl>
-      <w:tblPr>
-        <w:tblW w:type="dxa" w:w="9360"/>
-        <w:tblBorders>
-          <w:top w:val="single" w:color="auto" w:sz="4"/>
-          <w:left w:val="single" w:color="auto" w:sz="4"/>
-          <w:bottom w:val="single" w:color="auto" w:sz="4"/>
-          <w:right w:val="single" w:color="auto" w:sz="4"/>
-          <w:insideH w:val="single" w:color="auto" w:sz="4"/>
-          <w:insideV w:val="single" w:color="auto" w:sz="4"/>
-        </w:tblBorders>
-      </w:tblPr>
-      <w:tblGrid>
-        <w:gridCol w:w="9360"/>
-      </w:tblGrid>
-      <w:tr>
-        <w:tc>
-          <w:tcPr>
-            <w:tcW w:type="dxa" w:w="9360"/>
-            <w:tcBorders>
-              <w:top w:val="single" w:color="BFC7DD" w:sz="4"/>
-              <w:left w:val="single" w:color="1E2761" w:sz="18"/>
-              <w:bottom w:val="single" w:color="BFC7DD" w:sz="4"/>
-              <w:right w:val="single" w:color="BFC7DD" w:sz="4"/>
-            </w:tcBorders>
-            <w:shd w:fill="F5F5F5" w:color="auto" w:val="clear"/>
-            <w:tcMar>
-              <w:top w:type="dxa" w:w="80"/>
-              <w:left w:type="dxa" w:w="140"/>
-              <w:bottom w:type="dxa" w:w="80"/>
-              <w:right w:type="dxa" w:w="100"/>
-            </w:tcMar>
-          </w:tcPr>
-          <w:p>
-            <w:pPr>
-              <w:spacing w:after="0"/>
-            </w:pPr>
-            <w:r>
-              <w:rPr>
-                <w:rFonts w:ascii="Consolas" w:cs="Consolas" w:eastAsia="Consolas" w:hAnsi="Consolas"/>
-                <w:color w:val="1F1F1F"/>
-                <w:sz w:val="16"/>
-                <w:szCs w:val="16"/>
-              </w:rPr>
-              <w:t xml:space="preserve">import os</w:t>
-            </w:r>
-          </w:p>
-          <w:p>
-            <w:pPr>
-              <w:spacing w:after="0"/>
-            </w:pPr>
-            <w:r>
-              <w:rPr>
-                <w:rFonts w:ascii="Consolas" w:cs="Consolas" w:eastAsia="Consolas" w:hAnsi="Consolas"/>
-                <w:color w:val="1F1F1F"/>
-                <w:sz w:val="16"/>
-                <w:szCs w:val="16"/>
-              </w:rPr>
-              <w:t xml:space="preserve">import httpx</w:t>
-            </w:r>
-          </w:p>
-          <w:p>
-            <w:pPr>
-              <w:spacing w:after="0"/>
-            </w:pPr>
-            <w:r>
-              <w:rPr>
-                <w:rFonts w:ascii="Consolas" w:cs="Consolas" w:eastAsia="Consolas" w:hAnsi="Consolas"/>
-                <w:color w:val="1F1F1F"/>
-                <w:sz w:val="16"/>
-                <w:szCs w:val="16"/>
-              </w:rPr>
-              <w:t xml:space="preserve"> </w:t>
-            </w:r>
-          </w:p>
-          <w:p>
-            <w:pPr>
-              <w:spacing w:after="0"/>
-            </w:pPr>
-            <w:r>
-              <w:rPr>
-                <w:rFonts w:ascii="Consolas" w:cs="Consolas" w:eastAsia="Consolas" w:hAnsi="Consolas"/>
-                <w:color w:val="1F1F1F"/>
-                <w:sz w:val="16"/>
-                <w:szCs w:val="16"/>
-              </w:rPr>
-              <w:t xml:space="preserve">GATEWAY = os.getenv("GW_URL", "http://localhost:8000")</w:t>
-            </w:r>
-          </w:p>
-          <w:p>
-            <w:pPr>
-              <w:spacing w:after="0"/>
-            </w:pPr>
-            <w:r>
-              <w:rPr>
-                <w:rFonts w:ascii="Consolas" w:cs="Consolas" w:eastAsia="Consolas" w:hAnsi="Consolas"/>
-                <w:color w:val="1F1F1F"/>
-                <w:sz w:val="16"/>
-                <w:szCs w:val="16"/>
-              </w:rPr>
-              <w:t xml:space="preserve">CLAVE = os.environ["GW_KEY"]          # nunca escriba la clave en el código</w:t>
-            </w:r>
-          </w:p>
-          <w:p>
-            <w:pPr>
-              <w:spacing w:after="0"/>
-            </w:pPr>
-            <w:r>
-              <w:rPr>
-                <w:rFonts w:ascii="Consolas" w:cs="Consolas" w:eastAsia="Consolas" w:hAnsi="Consolas"/>
-                <w:color w:val="1F1F1F"/>
-                <w:sz w:val="16"/>
-                <w:szCs w:val="16"/>
-              </w:rPr>
-              <w:t xml:space="preserve"> </w:t>
-            </w:r>
-          </w:p>
-          <w:p>
-            <w:pPr>
-              <w:spacing w:after="0"/>
-            </w:pPr>
-            <w:r>
-              <w:rPr>
-                <w:rFonts w:ascii="Consolas" w:cs="Consolas" w:eastAsia="Consolas" w:hAnsi="Consolas"/>
-                <w:color w:val="1F1F1F"/>
-                <w:sz w:val="16"/>
-                <w:szCs w:val="16"/>
-              </w:rPr>
-              <w:t xml:space="preserve">r = httpx.post(</w:t>
-            </w:r>
-          </w:p>
-          <w:p>
-            <w:pPr>
-              <w:spacing w:after="0"/>
-            </w:pPr>
-            <w:r>
-              <w:rPr>
-                <w:rFonts w:ascii="Consolas" w:cs="Consolas" w:eastAsia="Consolas" w:hAnsi="Consolas"/>
-                <w:color w:val="1F1F1F"/>
-                <w:sz w:val="16"/>
-                <w:szCs w:val="16"/>
-              </w:rPr>
-              <w:t xml:space="preserve">    f"{GATEWAY}/v1/chat",</w:t>
-            </w:r>
-          </w:p>
-          <w:p>
-            <w:pPr>
-              <w:spacing w:after="0"/>
-            </w:pPr>
-            <w:r>
-              <w:rPr>
-                <w:rFonts w:ascii="Consolas" w:cs="Consolas" w:eastAsia="Consolas" w:hAnsi="Consolas"/>
-                <w:color w:val="1F1F1F"/>
-                <w:sz w:val="16"/>
-                <w:szCs w:val="16"/>
-              </w:rPr>
-              <w:t xml:space="preserve">    headers={"Authorization": f"Bearer {CLAVE}"},</w:t>
-            </w:r>
-          </w:p>
-          <w:p>
-            <w:pPr>
-              <w:spacing w:after="0"/>
-            </w:pPr>
-            <w:r>
-              <w:rPr>
-                <w:rFonts w:ascii="Consolas" w:cs="Consolas" w:eastAsia="Consolas" w:hAnsi="Consolas"/>
-                <w:color w:val="1F1F1F"/>
-                <w:sz w:val="16"/>
-                <w:szCs w:val="16"/>
-              </w:rPr>
-              <w:t xml:space="preserve">    json={"mensaje": "¿Cuál es la política de devoluciones?", "max_tokens": 200},</w:t>
-            </w:r>
-          </w:p>
-          <w:p>
-            <w:pPr>
-              <w:spacing w:after="0"/>
-            </w:pPr>
-            <w:r>
-              <w:rPr>
-                <w:rFonts w:ascii="Consolas" w:cs="Consolas" w:eastAsia="Consolas" w:hAnsi="Consolas"/>
-                <w:color w:val="1F1F1F"/>
-                <w:sz w:val="16"/>
-                <w:szCs w:val="16"/>
-              </w:rPr>
-              <w:t xml:space="preserve">    timeout=30,</w:t>
-            </w:r>
-          </w:p>
-          <w:p>
-            <w:pPr>
-              <w:spacing w:after="0"/>
-            </w:pPr>
-            <w:r>
-              <w:rPr>
-                <w:rFonts w:ascii="Consolas" w:cs="Consolas" w:eastAsia="Consolas" w:hAnsi="Consolas"/>
-                <w:color w:val="1F1F1F"/>
-                <w:sz w:val="16"/>
-                <w:szCs w:val="16"/>
-              </w:rPr>
-              <w:t xml:space="preserve">)</w:t>
-            </w:r>
-          </w:p>
-          <w:p>
-            <w:pPr>
-              <w:spacing w:after="0"/>
-            </w:pPr>
-            <w:r>
-              <w:rPr>
-                <w:rFonts w:ascii="Consolas" w:cs="Consolas" w:eastAsia="Consolas" w:hAnsi="Consolas"/>
-                <w:color w:val="1F1F1F"/>
-                <w:sz w:val="16"/>
-                <w:szCs w:val="16"/>
-              </w:rPr>
-              <w:t xml:space="preserve">datos = r.json()</w:t>
-            </w:r>
-          </w:p>
-          <w:p>
-            <w:pPr>
-              <w:spacing w:after="0"/>
-            </w:pPr>
-            <w:r>
-              <w:rPr>
-                <w:rFonts w:ascii="Consolas" w:cs="Consolas" w:eastAsia="Consolas" w:hAnsi="Consolas"/>
-                <w:color w:val="1F1F1F"/>
-                <w:sz w:val="16"/>
-                <w:szCs w:val="16"/>
-              </w:rPr>
-              <w:t xml:space="preserve">if r.status_code == 200:</w:t>
-            </w:r>
-          </w:p>
-          <w:p>
-            <w:pPr>
-              <w:spacing w:after="0"/>
-            </w:pPr>
-            <w:r>
-              <w:rPr>
-                <w:rFonts w:ascii="Consolas" w:cs="Consolas" w:eastAsia="Consolas" w:hAnsi="Consolas"/>
-                <w:color w:val="1F1F1F"/>
-                <w:sz w:val="16"/>
-                <w:szCs w:val="16"/>
-              </w:rPr>
-              <w:t xml:space="preserve">    print(datos["respuesta"])</w:t>
-            </w:r>
-          </w:p>
-          <w:p>
-            <w:pPr>
-              <w:spacing w:after="0"/>
-            </w:pPr>
-            <w:r>
-              <w:rPr>
-                <w:rFonts w:ascii="Consolas" w:cs="Consolas" w:eastAsia="Consolas" w:hAnsi="Consolas"/>
-                <w:color w:val="1F1F1F"/>
-                <w:sz w:val="16"/>
-                <w:szCs w:val="16"/>
-              </w:rPr>
-              <w:t xml:space="preserve">elif r.status_code == 429:</w:t>
-            </w:r>
-          </w:p>
-          <w:p>
-            <w:pPr>
-              <w:spacing w:after="0"/>
-            </w:pPr>
-            <w:r>
-              <w:rPr>
-                <w:rFonts w:ascii="Consolas" w:cs="Consolas" w:eastAsia="Consolas" w:hAnsi="Consolas"/>
-                <w:color w:val="1F1F1F"/>
-                <w:sz w:val="16"/>
-                <w:szCs w:val="16"/>
-              </w:rPr>
-              <w:t xml:space="preserve">    print("Límite alcanzado; reintentar en", r.headers.get("Retry-After"), "segundos")</w:t>
-            </w:r>
-          </w:p>
-          <w:p>
-            <w:pPr>
-              <w:spacing w:after="0"/>
-            </w:pPr>
-            <w:r>
-              <w:rPr>
-                <w:rFonts w:ascii="Consolas" w:cs="Consolas" w:eastAsia="Consolas" w:hAnsi="Consolas"/>
-                <w:color w:val="1F1F1F"/>
-                <w:sz w:val="16"/>
-                <w:szCs w:val="16"/>
-              </w:rPr>
-              <w:t xml:space="preserve">else:</w:t>
-            </w:r>
-          </w:p>
-          <w:p>
-            <w:pPr>
-              <w:spacing w:after="0"/>
-            </w:pPr>
-            <w:r>
-              <w:rPr>
-                <w:rFonts w:ascii="Consolas" w:cs="Consolas" w:eastAsia="Consolas" w:hAnsi="Consolas"/>
-                <w:color w:val="1F1F1F"/>
-                <w:sz w:val="16"/>
-                <w:szCs w:val="16"/>
-              </w:rPr>
-              <w:t xml:space="preserve">    print(f"Error {r.status_code}: {datos['mensaje']} (request_id={datos['request_id']})")</w:t>
-            </w:r>
-          </w:p>
-        </w:tc>
-      </w:tr>
-    </w:tbl>
-    <w:p>
-      <w:pPr>
-        <w:spacing w:after="60"/>
-      </w:pPr>
-    </w:p>
-    <w:p>
-      <w:pPr>
-        <w:pStyle w:val="Heading2"/>
-      </w:pPr>
-      <w:r>
-        <w:t xml:space="preserve">3.4 Desde el navegador</w:t>
-      </w:r>
-    </w:p>
-    <w:p>
-      <w:r>
-        <w:t xml:space="preserve">Fuera de producción, abra </w:t>
+        <w:t xml:space="preserve">3.3 Desde el navegador</w:t>
+      </w:r>
+    </w:p>
+    <w:p>
+      <w:r>
+        <w:t xml:space="preserve">Fuera de producción, abra la dirección del gateway seguida de </w:t>
       </w:r>
       <w:r>
         <w:rPr>
@@ -2118,7 +2021,7 @@
           <w:sz w:val="19"/>
           <w:szCs w:val="19"/>
         </w:rPr>
-        <w:t xml:space="preserve">http://localhost:8000/docs</w:t>
+        <w:t xml:space="preserve">/docs</w:t>
       </w:r>
       <w:r>
         <w:t xml:space="preserve">, pulse </w:t>
@@ -2173,7 +2076,7 @@
         <w:pStyle w:val="Heading2"/>
       </w:pPr>
       <w:r>
-        <w:t xml:space="preserve">3.5 Respuesta</w:t>
+        <w:t xml:space="preserve">3.4 Respuesta</w:t>
       </w:r>
     </w:p>
     <w:tbl>
@@ -6565,7 +6468,7 @@
     </w:p>
     <w:p>
       <w:r>
-        <w:t xml:space="preserve">Estas tareas se hacen en el servidor donde está instalado el gateway, con el entorno virtual activo. </w:t>
+        <w:t xml:space="preserve">Estas tareas se hacen en la máquina Linux donde está instalado el gateway, dentro de la carpeta del proyecto. </w:t>
       </w:r>
       <w:r>
         <w:rPr>
@@ -6590,10 +6493,10 @@
           <w:b/>
           <w:bCs/>
         </w:rPr>
-        <w:t xml:space="preserve"> requiere reiniciar el gateway</w:t>
-      </w:r>
-      <w:r>
-        <w:t xml:space="preserve"> (</w:t>
+        <w:t xml:space="preserve"> requiere reiniciar el gateway:</w:t>
+      </w:r>
+      <w:r>
+        <w:t xml:space="preserve"> </w:t>
       </w:r>
       <w:r>
         <w:rPr>
@@ -6602,10 +6505,34 @@
           <w:sz w:val="19"/>
           <w:szCs w:val="19"/>
         </w:rPr>
+        <w:t xml:space="preserve">make detener &amp;&amp; make iniciar</w:t>
+      </w:r>
+      <w:r>
+        <w:t xml:space="preserve"> si corre en segundo plano, o </w:t>
+      </w:r>
+      <w:r>
+        <w:rPr>
+          <w:rFonts w:ascii="Consolas" w:cs="Consolas" w:eastAsia="Consolas" w:hAnsi="Consolas"/>
+          <w:color w:val="8B1A1A"/>
+          <w:sz w:val="19"/>
+          <w:szCs w:val="19"/>
+        </w:rPr>
         <w:t xml:space="preserve">Ctrl + C</w:t>
       </w:r>
       <w:r>
-        <w:t xml:space="preserve"> y volver a arrancar).</w:t>
+        <w:t xml:space="preserve"> y </w:t>
+      </w:r>
+      <w:r>
+        <w:rPr>
+          <w:rFonts w:ascii="Consolas" w:cs="Consolas" w:eastAsia="Consolas" w:hAnsi="Consolas"/>
+          <w:color w:val="8B1A1A"/>
+          <w:sz w:val="19"/>
+          <w:szCs w:val="19"/>
+        </w:rPr>
+        <w:t xml:space="preserve">make protegido</w:t>
+      </w:r>
+      <w:r>
+        <w:t xml:space="preserve"> si corre en primer plano.</w:t>
       </w:r>
     </w:p>
     <w:p>
@@ -6660,7 +6587,7 @@
                 <w:sz w:val="16"/>
                 <w:szCs w:val="16"/>
               </w:rPr>
-              <w:t xml:space="preserve">python scripts/generar_clave_cliente.py equipo_ventas</w:t>
+              <w:t xml:space="preserve">venv/bin/python scripts/generar_clave_cliente.py equipo_ventas</w:t>
             </w:r>
           </w:p>
         </w:tc>
@@ -7435,7 +7362,7 @@
         <w:t xml:space="preserve">degradado: true</w:t>
       </w:r>
       <w:r>
-        <w:t xml:space="preserve">. Los detalles de cada proveedor están en el Manual de instalación, sección 5.</w:t>
+        <w:t xml:space="preserve">. Los detalles de cada proveedor están en el Manual de instalación, sección 9.</w:t>
       </w:r>
     </w:p>
     <w:p>
@@ -7471,7 +7398,7 @@
           <w:sz w:val="19"/>
           <w:szCs w:val="19"/>
         </w:rPr>
-        <w:t xml:space="preserve">GET /health</w:t>
+        <w:t xml:space="preserve">make estado</w:t>
       </w:r>
       <w:r>
         <w:t xml:space="preserve"> responde </w:t>
@@ -9160,7 +9087,7 @@
     </w:p>
     <w:p>
       <w:r>
-        <w:t xml:space="preserve">En PowerShell:</w:t>
+        <w:t xml:space="preserve">Ver los intentos de manipulación bloqueados:</w:t>
       </w:r>
     </w:p>
     <w:tbl>
@@ -9207,7 +9134,7 @@
                 <w:sz w:val="16"/>
                 <w:szCs w:val="16"/>
               </w:rPr>
-              <w:t xml:space="preserve">Select-String -Path logs\gateway.jsonl -Pattern '41bbfe68765947be'</w:t>
+              <w:t xml:space="preserve">grep 'bloqueado_llm01' logs/gateway.jsonl</w:t>
             </w:r>
           </w:p>
         </w:tc>
@@ -9220,7 +9147,7 @@
     </w:p>
     <w:p>
       <w:r>
-        <w:t xml:space="preserve">Ver los intentos de manipulación bloqueados:</w:t>
+        <w:t xml:space="preserve">Resumen de resultados:</w:t>
       </w:r>
     </w:p>
     <w:tbl>
@@ -9267,67 +9194,7 @@
                 <w:sz w:val="16"/>
                 <w:szCs w:val="16"/>
               </w:rPr>
-              <w:t xml:space="preserve">grep 'bloqueado_llm01' logs/gateway.jsonl</w:t>
-            </w:r>
-          </w:p>
-        </w:tc>
-      </w:tr>
-    </w:tbl>
-    <w:p>
-      <w:pPr>
-        <w:spacing w:after="60"/>
-      </w:pPr>
-    </w:p>
-    <w:p>
-      <w:r>
-        <w:t xml:space="preserve">Resumen de resultados (funciona en cualquier sistema):</w:t>
-      </w:r>
-    </w:p>
-    <w:tbl>
-      <w:tblPr>
-        <w:tblW w:type="dxa" w:w="9360"/>
-        <w:tblBorders>
-          <w:top w:val="single" w:color="auto" w:sz="4"/>
-          <w:left w:val="single" w:color="auto" w:sz="4"/>
-          <w:bottom w:val="single" w:color="auto" w:sz="4"/>
-          <w:right w:val="single" w:color="auto" w:sz="4"/>
-          <w:insideH w:val="single" w:color="auto" w:sz="4"/>
-          <w:insideV w:val="single" w:color="auto" w:sz="4"/>
-        </w:tblBorders>
-      </w:tblPr>
-      <w:tblGrid>
-        <w:gridCol w:w="9360"/>
-      </w:tblGrid>
-      <w:tr>
-        <w:tc>
-          <w:tcPr>
-            <w:tcW w:type="dxa" w:w="9360"/>
-            <w:tcBorders>
-              <w:top w:val="single" w:color="BFC7DD" w:sz="4"/>
-              <w:left w:val="single" w:color="1E2761" w:sz="18"/>
-              <w:bottom w:val="single" w:color="BFC7DD" w:sz="4"/>
-              <w:right w:val="single" w:color="BFC7DD" w:sz="4"/>
-            </w:tcBorders>
-            <w:shd w:fill="F5F5F5" w:color="auto" w:val="clear"/>
-            <w:tcMar>
-              <w:top w:type="dxa" w:w="80"/>
-              <w:left w:type="dxa" w:w="140"/>
-              <w:bottom w:type="dxa" w:w="80"/>
-              <w:right w:type="dxa" w:w="100"/>
-            </w:tcMar>
-          </w:tcPr>
-          <w:p>
-            <w:pPr>
-              <w:spacing w:after="0"/>
-            </w:pPr>
-            <w:r>
-              <w:rPr>
-                <w:rFonts w:ascii="Consolas" w:cs="Consolas" w:eastAsia="Consolas" w:hAnsi="Consolas"/>
-                <w:color w:val="1F1F1F"/>
-                <w:sz w:val="16"/>
-                <w:szCs w:val="16"/>
-              </w:rPr>
-              <w:t xml:space="preserve">python -c "import json,collections; print(collections.Counter(json.loads(l).get('resultado') for l in open('logs/gateway.jsonl', encoding='utf-8') if '\"solicitud\"' in l))"</w:t>
+              <w:t xml:space="preserve">venv/bin/python -c "import json,collections; print(collections.Counter(json.loads(l).get('resultado') for l in open('logs/gateway.jsonl', encoding='utf-8') if '\"solicitud\"' in l))"</w:t>
             </w:r>
           </w:p>
         </w:tc>
@@ -9902,7 +9769,7 @@
                 <w:sz w:val="16"/>
                 <w:szCs w:val="16"/>
               </w:rPr>
-              <w:t xml:space="preserve">python -m pytest -v</w:t>
+              <w:t xml:space="preserve">make verificar</w:t>
             </w:r>
           </w:p>
           <w:p>
@@ -9916,7 +9783,21 @@
                 <w:sz w:val="16"/>
                 <w:szCs w:val="16"/>
               </w:rPr>
-              <w:t xml:space="preserve">python scripts/demo_antes_despues.py</w:t>
+              <w:t xml:space="preserve">make test</w:t>
+            </w:r>
+          </w:p>
+          <w:p>
+            <w:pPr>
+              <w:spacing w:after="0"/>
+            </w:pPr>
+            <w:r>
+              <w:rPr>
+                <w:rFonts w:ascii="Consolas" w:cs="Consolas" w:eastAsia="Consolas" w:hAnsi="Consolas"/>
+                <w:color w:val="1F1F1F"/>
+                <w:sz w:val="16"/>
+                <w:szCs w:val="16"/>
+              </w:rPr>
+              <w:t xml:space="preserve">make evidencia</w:t>
             </w:r>
           </w:p>
         </w:tc>
@@ -9944,66 +9825,10 @@
           <w:sz w:val="19"/>
           <w:szCs w:val="19"/>
         </w:rPr>
-        <w:t xml:space="preserve">pytest</w:t>
-      </w:r>
-      <w:r>
-        <w:t xml:space="preserve"> ejecuta 63 pruebas (puede mostrar un aviso, </w:t>
-      </w:r>
-      <w:r>
-        <w:rPr>
-          <w:rFonts w:ascii="Consolas" w:cs="Consolas" w:eastAsia="Consolas" w:hAnsi="Consolas"/>
-          <w:color w:val="8B1A1A"/>
-          <w:sz w:val="19"/>
-          <w:szCs w:val="19"/>
-        </w:rPr>
-        <w:t xml:space="preserve">1 warning</w:t>
-      </w:r>
-      <w:r>
-        <w:t xml:space="preserve">, que es inofensivo). Por cada protección hay una prueba que demuestra que el ataque </w:t>
-      </w:r>
-      <w:r>
-        <w:rPr>
-          <w:b/>
-          <w:bCs/>
-        </w:rPr>
-        <w:t xml:space="preserve">funciona</w:t>
-      </w:r>
-      <w:r>
-        <w:t xml:space="preserve"> sin ella (</w:t>
-      </w:r>
-      <w:r>
-        <w:rPr>
-          <w:rFonts w:ascii="Consolas" w:cs="Consolas" w:eastAsia="Consolas" w:hAnsi="Consolas"/>
-          <w:color w:val="8B1A1A"/>
-          <w:sz w:val="19"/>
-          <w:szCs w:val="19"/>
-        </w:rPr>
-        <w:t xml:space="preserve">test_linea_base_…</w:t>
-      </w:r>
-      <w:r>
-        <w:t xml:space="preserve">) y otra que demuestra que queda </w:t>
-      </w:r>
-      <w:r>
-        <w:rPr>
-          <w:b/>
-          <w:bCs/>
-        </w:rPr>
-        <w:t xml:space="preserve">bloqueado</w:t>
-      </w:r>
-      <w:r>
-        <w:t xml:space="preserve"> con ella (</w:t>
-      </w:r>
-      <w:r>
-        <w:rPr>
-          <w:rFonts w:ascii="Consolas" w:cs="Consolas" w:eastAsia="Consolas" w:hAnsi="Consolas"/>
-          <w:color w:val="8B1A1A"/>
-          <w:sz w:val="19"/>
-          <w:szCs w:val="19"/>
-        </w:rPr>
-        <w:t xml:space="preserve">test_con_mitigacion_…</w:t>
-      </w:r>
-      <w:r>
-        <w:t xml:space="preserve">).</w:t>
+        <w:t xml:space="preserve">make verificar</w:t>
+      </w:r>
+      <w:r>
+        <w:t xml:space="preserve"> arranca el gateway, hace seis comprobaciones con solicitudes reales y lo detiene.</w:t>
       </w:r>
     </w:p>
     <w:p>
@@ -10023,10 +9848,10 @@
           <w:sz w:val="19"/>
           <w:szCs w:val="19"/>
         </w:rPr>
-        <w:t xml:space="preserve">demo_antes_despues.py</w:t>
-      </w:r>
-      <w:r>
-        <w:t xml:space="preserve"> ejecuta seis escenarios, muestra una tabla comparativa y genera </w:t>
+        <w:t xml:space="preserve">make test</w:t>
+      </w:r>
+      <w:r>
+        <w:t xml:space="preserve"> ejecuta 63 pruebas (puede mostrar un aviso, </w:t>
       </w:r>
       <w:r>
         <w:rPr>
@@ -10035,6 +9860,85 @@
           <w:sz w:val="19"/>
           <w:szCs w:val="19"/>
         </w:rPr>
+        <w:t xml:space="preserve">1 warning</w:t>
+      </w:r>
+      <w:r>
+        <w:t xml:space="preserve">, que es inofensivo). Por cada protección hay una prueba que demuestra que el ataque </w:t>
+      </w:r>
+      <w:r>
+        <w:rPr>
+          <w:b/>
+          <w:bCs/>
+        </w:rPr>
+        <w:t xml:space="preserve">funciona</w:t>
+      </w:r>
+      <w:r>
+        <w:t xml:space="preserve"> sin ella (</w:t>
+      </w:r>
+      <w:r>
+        <w:rPr>
+          <w:rFonts w:ascii="Consolas" w:cs="Consolas" w:eastAsia="Consolas" w:hAnsi="Consolas"/>
+          <w:color w:val="8B1A1A"/>
+          <w:sz w:val="19"/>
+          <w:szCs w:val="19"/>
+        </w:rPr>
+        <w:t xml:space="preserve">test_linea_base_…</w:t>
+      </w:r>
+      <w:r>
+        <w:t xml:space="preserve">) y otra que demuestra que queda </w:t>
+      </w:r>
+      <w:r>
+        <w:rPr>
+          <w:b/>
+          <w:bCs/>
+        </w:rPr>
+        <w:t xml:space="preserve">bloqueado</w:t>
+      </w:r>
+      <w:r>
+        <w:t xml:space="preserve"> con ella (</w:t>
+      </w:r>
+      <w:r>
+        <w:rPr>
+          <w:rFonts w:ascii="Consolas" w:cs="Consolas" w:eastAsia="Consolas" w:hAnsi="Consolas"/>
+          <w:color w:val="8B1A1A"/>
+          <w:sz w:val="19"/>
+          <w:szCs w:val="19"/>
+        </w:rPr>
+        <w:t xml:space="preserve">test_con_mitigacion_…</w:t>
+      </w:r>
+      <w:r>
+        <w:t xml:space="preserve">).</w:t>
+      </w:r>
+    </w:p>
+    <w:p>
+      <w:pPr>
+        <w:pStyle w:val="ListParagraph"/>
+        <w:numPr>
+          <w:ilvl w:val="0"/>
+          <w:numId w:val="2"/>
+        </w:numPr>
+      </w:pPr>
+      <w:r>
+        <w:rPr>
+          <w:rFonts w:ascii="Consolas" w:cs="Consolas" w:eastAsia="Consolas" w:hAnsi="Consolas"/>
+          <w:b/>
+          <w:bCs/>
+          <w:color w:val="8B1A1A"/>
+          <w:sz w:val="19"/>
+          <w:szCs w:val="19"/>
+        </w:rPr>
+        <w:t xml:space="preserve">make evidencia</w:t>
+      </w:r>
+      <w:r>
+        <w:t xml:space="preserve"> ejecuta seis escenarios, muestra una tabla comparativa y genera </w:t>
+      </w:r>
+      <w:r>
+        <w:rPr>
+          <w:rFonts w:ascii="Consolas" w:cs="Consolas" w:eastAsia="Consolas" w:hAnsi="Consolas"/>
+          <w:color w:val="8B1A1A"/>
+          <w:sz w:val="19"/>
+          <w:szCs w:val="19"/>
+        </w:rPr>
         <w:t xml:space="preserve">docs/evidencias/REPORTE_EVIDENCIA.md</w:t>
       </w:r>
       <w:r>
@@ -10051,17 +9955,17 @@
     </w:p>
     <w:p>
       <w:r>
-        <w:t xml:space="preserve">Se usan dos terminales: en la primera corre el gateway y en la segunda se lanzan los ataques. En Windows use </w:t>
+        <w:t xml:space="preserve">Se usan dos terminales en la máquina Linux (en Codespaces, el botón </w:t>
       </w:r>
       <w:r>
         <w:rPr>
           <w:b/>
           <w:bCs/>
         </w:rPr>
-        <w:t xml:space="preserve">Git Bash</w:t>
-      </w:r>
-      <w:r>
-        <w:t xml:space="preserve"> para ambas.</w:t>
+        <w:t xml:space="preserve">+</w:t>
+      </w:r>
+      <w:r>
+        <w:t xml:space="preserve"> abre la segunda): en la primera corre el gateway y en la segunda se lanzan los ataques.</w:t>
       </w:r>
     </w:p>
     <w:p>
@@ -10113,7 +10017,7 @@
                 <w:sz w:val="16"/>
                 <w:szCs w:val="16"/>
               </w:rPr>
-              <w:t xml:space="preserve">export GW_KEY=gw_...su_clave...</w:t>
+              <w:t xml:space="preserve">export GW_KEY=$(cat .gw_key)</w:t>
             </w:r>
           </w:p>
           <w:p>
@@ -10176,9 +10080,9 @@
         </w:tblBorders>
       </w:tblPr>
       <w:tblGrid>
-        <w:gridCol w:w="1994"/>
-        <w:gridCol w:w="4579"/>
-        <w:gridCol w:w="2787"/>
+        <w:gridCol w:w="2211"/>
+        <w:gridCol w:w="4098"/>
+        <w:gridCol w:w="3051"/>
       </w:tblGrid>
       <w:tr>
         <w:trPr>
@@ -10186,7 +10090,7 @@
         </w:trPr>
         <w:tc>
           <w:tcPr>
-            <w:tcW w:type="dxa" w:w="1994"/>
+            <w:tcW w:type="dxa" w:w="2211"/>
             <w:tcBorders>
               <w:top w:val="single" w:color="BFC7DD" w:sz="4"/>
               <w:left w:val="single" w:color="BFC7DD" w:sz="4"/>
@@ -10216,7 +10120,7 @@
         </w:tc>
         <w:tc>
           <w:tcPr>
-            <w:tcW w:type="dxa" w:w="4579"/>
+            <w:tcW w:type="dxa" w:w="4098"/>
             <w:tcBorders>
               <w:top w:val="single" w:color="BFC7DD" w:sz="4"/>
               <w:left w:val="single" w:color="BFC7DD" w:sz="4"/>
@@ -10246,7 +10150,7 @@
         </w:tc>
         <w:tc>
           <w:tcPr>
-            <w:tcW w:type="dxa" w:w="2787"/>
+            <w:tcW w:type="dxa" w:w="3051"/>
             <w:tcBorders>
               <w:top w:val="single" w:color="BFC7DD" w:sz="4"/>
               <w:left w:val="single" w:color="BFC7DD" w:sz="4"/>
@@ -10278,7 +10182,7 @@
       <w:tr>
         <w:tc>
           <w:tcPr>
-            <w:tcW w:type="dxa" w:w="1994"/>
+            <w:tcW w:type="dxa" w:w="2211"/>
             <w:tcBorders>
               <w:top w:val="single" w:color="BFC7DD" w:sz="4"/>
               <w:left w:val="single" w:color="BFC7DD" w:sz="4"/>
@@ -10306,36 +10210,36 @@
         </w:tc>
         <w:tc>
           <w:tcPr>
-            <w:tcW w:type="dxa" w:w="4579"/>
-            <w:tcBorders>
-              <w:top w:val="single" w:color="BFC7DD" w:sz="4"/>
-              <w:left w:val="single" w:color="BFC7DD" w:sz="4"/>
-              <w:bottom w:val="single" w:color="BFC7DD" w:sz="4"/>
-              <w:right w:val="single" w:color="BFC7DD" w:sz="4"/>
-            </w:tcBorders>
-            <w:shd w:fill="F2F4FA" w:color="auto" w:val="clear"/>
-            <w:tcMar>
-              <w:top w:type="dxa" w:w="60"/>
-              <w:left w:type="dxa" w:w="100"/>
-              <w:bottom w:type="dxa" w:w="60"/>
-              <w:right w:type="dxa" w:w="100"/>
-            </w:tcMar>
-          </w:tcPr>
-          <w:p>
-            <w:r>
-              <w:rPr>
-                <w:rFonts w:ascii="Consolas" w:cs="Consolas" w:eastAsia="Consolas" w:hAnsi="Consolas"/>
-                <w:color w:val="212121"/>
-                <w:sz w:val="18"/>
-                <w:szCs w:val="18"/>
-              </w:rPr>
-              <w:t xml:space="preserve">MITIGACION_LLM01=false uvicorn gateway.main:app --port 8000</w:t>
-            </w:r>
-          </w:p>
-        </w:tc>
-        <w:tc>
-          <w:tcPr>
-            <w:tcW w:type="dxa" w:w="2787"/>
+            <w:tcW w:type="dxa" w:w="4098"/>
+            <w:tcBorders>
+              <w:top w:val="single" w:color="BFC7DD" w:sz="4"/>
+              <w:left w:val="single" w:color="BFC7DD" w:sz="4"/>
+              <w:bottom w:val="single" w:color="BFC7DD" w:sz="4"/>
+              <w:right w:val="single" w:color="BFC7DD" w:sz="4"/>
+            </w:tcBorders>
+            <w:shd w:fill="F2F4FA" w:color="auto" w:val="clear"/>
+            <w:tcMar>
+              <w:top w:type="dxa" w:w="60"/>
+              <w:left w:type="dxa" w:w="100"/>
+              <w:bottom w:type="dxa" w:w="60"/>
+              <w:right w:type="dxa" w:w="100"/>
+            </w:tcMar>
+          </w:tcPr>
+          <w:p>
+            <w:r>
+              <w:rPr>
+                <w:rFonts w:ascii="Consolas" w:cs="Consolas" w:eastAsia="Consolas" w:hAnsi="Consolas"/>
+                <w:color w:val="212121"/>
+                <w:sz w:val="18"/>
+                <w:szCs w:val="18"/>
+              </w:rPr>
+              <w:t xml:space="preserve">make linea-base M=LLM01</w:t>
+            </w:r>
+          </w:p>
+        </w:tc>
+        <w:tc>
+          <w:tcPr>
+            <w:tcW w:type="dxa" w:w="3051"/>
             <w:tcBorders>
               <w:top w:val="single" w:color="BFC7DD" w:sz="4"/>
               <w:left w:val="single" w:color="BFC7DD" w:sz="4"/>
@@ -10366,7 +10270,7 @@
       <w:tr>
         <w:tc>
           <w:tcPr>
-            <w:tcW w:type="dxa" w:w="1994"/>
+            <w:tcW w:type="dxa" w:w="2211"/>
             <w:tcBorders>
               <w:top w:val="single" w:color="BFC7DD" w:sz="4"/>
               <w:left w:val="single" w:color="BFC7DD" w:sz="4"/>
@@ -10394,36 +10298,36 @@
         </w:tc>
         <w:tc>
           <w:tcPr>
-            <w:tcW w:type="dxa" w:w="4579"/>
-            <w:tcBorders>
-              <w:top w:val="single" w:color="BFC7DD" w:sz="4"/>
-              <w:left w:val="single" w:color="BFC7DD" w:sz="4"/>
-              <w:bottom w:val="single" w:color="BFC7DD" w:sz="4"/>
-              <w:right w:val="single" w:color="BFC7DD" w:sz="4"/>
-            </w:tcBorders>
-            <w:shd w:fill="F2F4FA" w:color="auto" w:val="clear"/>
-            <w:tcMar>
-              <w:top w:type="dxa" w:w="60"/>
-              <w:left w:type="dxa" w:w="100"/>
-              <w:bottom w:type="dxa" w:w="60"/>
-              <w:right w:type="dxa" w:w="100"/>
-            </w:tcMar>
-          </w:tcPr>
-          <w:p>
-            <w:r>
-              <w:rPr>
-                <w:rFonts w:ascii="Consolas" w:cs="Consolas" w:eastAsia="Consolas" w:hAnsi="Consolas"/>
-                <w:color w:val="212121"/>
-                <w:sz w:val="18"/>
-                <w:szCs w:val="18"/>
-              </w:rPr>
-              <w:t xml:space="preserve">MITIGACION_LLM01=false MITIGACION_LLM07=false uvicorn gateway.main:app --port 8000</w:t>
-            </w:r>
-          </w:p>
-        </w:tc>
-        <w:tc>
-          <w:tcPr>
-            <w:tcW w:type="dxa" w:w="2787"/>
+            <w:tcW w:type="dxa" w:w="4098"/>
+            <w:tcBorders>
+              <w:top w:val="single" w:color="BFC7DD" w:sz="4"/>
+              <w:left w:val="single" w:color="BFC7DD" w:sz="4"/>
+              <w:bottom w:val="single" w:color="BFC7DD" w:sz="4"/>
+              <w:right w:val="single" w:color="BFC7DD" w:sz="4"/>
+            </w:tcBorders>
+            <w:shd w:fill="F2F4FA" w:color="auto" w:val="clear"/>
+            <w:tcMar>
+              <w:top w:type="dxa" w:w="60"/>
+              <w:left w:type="dxa" w:w="100"/>
+              <w:bottom w:type="dxa" w:w="60"/>
+              <w:right w:type="dxa" w:w="100"/>
+            </w:tcMar>
+          </w:tcPr>
+          <w:p>
+            <w:r>
+              <w:rPr>
+                <w:rFonts w:ascii="Consolas" w:cs="Consolas" w:eastAsia="Consolas" w:hAnsi="Consolas"/>
+                <w:color w:val="212121"/>
+                <w:sz w:val="18"/>
+                <w:szCs w:val="18"/>
+              </w:rPr>
+              <w:t xml:space="preserve">MITIGACION_LLM01=false make linea-base M=LLM07</w:t>
+            </w:r>
+          </w:p>
+        </w:tc>
+        <w:tc>
+          <w:tcPr>
+            <w:tcW w:type="dxa" w:w="3051"/>
             <w:tcBorders>
               <w:top w:val="single" w:color="BFC7DD" w:sz="4"/>
               <w:left w:val="single" w:color="BFC7DD" w:sz="4"/>
@@ -10454,7 +10358,7 @@
       <w:tr>
         <w:tc>
           <w:tcPr>
-            <w:tcW w:type="dxa" w:w="1994"/>
+            <w:tcW w:type="dxa" w:w="2211"/>
             <w:tcBorders>
               <w:top w:val="single" w:color="BFC7DD" w:sz="4"/>
               <w:left w:val="single" w:color="BFC7DD" w:sz="4"/>
@@ -10482,36 +10386,36 @@
         </w:tc>
         <w:tc>
           <w:tcPr>
-            <w:tcW w:type="dxa" w:w="4579"/>
-            <w:tcBorders>
-              <w:top w:val="single" w:color="BFC7DD" w:sz="4"/>
-              <w:left w:val="single" w:color="BFC7DD" w:sz="4"/>
-              <w:bottom w:val="single" w:color="BFC7DD" w:sz="4"/>
-              <w:right w:val="single" w:color="BFC7DD" w:sz="4"/>
-            </w:tcBorders>
-            <w:shd w:fill="F2F4FA" w:color="auto" w:val="clear"/>
-            <w:tcMar>
-              <w:top w:type="dxa" w:w="60"/>
-              <w:left w:type="dxa" w:w="100"/>
-              <w:bottom w:type="dxa" w:w="60"/>
-              <w:right w:type="dxa" w:w="100"/>
-            </w:tcMar>
-          </w:tcPr>
-          <w:p>
-            <w:r>
-              <w:rPr>
-                <w:rFonts w:ascii="Consolas" w:cs="Consolas" w:eastAsia="Consolas" w:hAnsi="Consolas"/>
-                <w:color w:val="212121"/>
-                <w:sz w:val="18"/>
-                <w:szCs w:val="18"/>
-              </w:rPr>
-              <w:t xml:space="preserve">MITIGACION_LLM10=false uvicorn gateway.main:app --port 8000</w:t>
-            </w:r>
-          </w:p>
-        </w:tc>
-        <w:tc>
-          <w:tcPr>
-            <w:tcW w:type="dxa" w:w="2787"/>
+            <w:tcW w:type="dxa" w:w="4098"/>
+            <w:tcBorders>
+              <w:top w:val="single" w:color="BFC7DD" w:sz="4"/>
+              <w:left w:val="single" w:color="BFC7DD" w:sz="4"/>
+              <w:bottom w:val="single" w:color="BFC7DD" w:sz="4"/>
+              <w:right w:val="single" w:color="BFC7DD" w:sz="4"/>
+            </w:tcBorders>
+            <w:shd w:fill="F2F4FA" w:color="auto" w:val="clear"/>
+            <w:tcMar>
+              <w:top w:type="dxa" w:w="60"/>
+              <w:left w:type="dxa" w:w="100"/>
+              <w:bottom w:type="dxa" w:w="60"/>
+              <w:right w:type="dxa" w:w="100"/>
+            </w:tcMar>
+          </w:tcPr>
+          <w:p>
+            <w:r>
+              <w:rPr>
+                <w:rFonts w:ascii="Consolas" w:cs="Consolas" w:eastAsia="Consolas" w:hAnsi="Consolas"/>
+                <w:color w:val="212121"/>
+                <w:sz w:val="18"/>
+                <w:szCs w:val="18"/>
+              </w:rPr>
+              <w:t xml:space="preserve">make linea-base M=LLM10</w:t>
+            </w:r>
+          </w:p>
+        </w:tc>
+        <w:tc>
+          <w:tcPr>
+            <w:tcW w:type="dxa" w:w="3051"/>
             <w:tcBorders>
               <w:top w:val="single" w:color="BFC7DD" w:sz="4"/>
               <w:left w:val="single" w:color="BFC7DD" w:sz="4"/>
@@ -10542,7 +10446,7 @@
       <w:tr>
         <w:tc>
           <w:tcPr>
-            <w:tcW w:type="dxa" w:w="1994"/>
+            <w:tcW w:type="dxa" w:w="2211"/>
             <w:tcBorders>
               <w:top w:val="single" w:color="BFC7DD" w:sz="4"/>
               <w:left w:val="single" w:color="BFC7DD" w:sz="4"/>
@@ -10570,36 +10474,36 @@
         </w:tc>
         <w:tc>
           <w:tcPr>
-            <w:tcW w:type="dxa" w:w="4579"/>
-            <w:tcBorders>
-              <w:top w:val="single" w:color="BFC7DD" w:sz="4"/>
-              <w:left w:val="single" w:color="BFC7DD" w:sz="4"/>
-              <w:bottom w:val="single" w:color="BFC7DD" w:sz="4"/>
-              <w:right w:val="single" w:color="BFC7DD" w:sz="4"/>
-            </w:tcBorders>
-            <w:shd w:fill="F2F4FA" w:color="auto" w:val="clear"/>
-            <w:tcMar>
-              <w:top w:type="dxa" w:w="60"/>
-              <w:left w:type="dxa" w:w="100"/>
-              <w:bottom w:type="dxa" w:w="60"/>
-              <w:right w:type="dxa" w:w="100"/>
-            </w:tcMar>
-          </w:tcPr>
-          <w:p>
-            <w:r>
-              <w:rPr>
-                <w:rFonts w:ascii="Consolas" w:cs="Consolas" w:eastAsia="Consolas" w:hAnsi="Consolas"/>
-                <w:color w:val="212121"/>
-                <w:sz w:val="18"/>
-                <w:szCs w:val="18"/>
-              </w:rPr>
-              <w:t xml:space="preserve">MITIGACION_LLM02=false SIMULAR_FALLA_UPSTREAM=error_con_clave uvicorn gateway.main:app --port 8000</w:t>
-            </w:r>
-          </w:p>
-        </w:tc>
-        <w:tc>
-          <w:tcPr>
-            <w:tcW w:type="dxa" w:w="2787"/>
+            <w:tcW w:type="dxa" w:w="4098"/>
+            <w:tcBorders>
+              <w:top w:val="single" w:color="BFC7DD" w:sz="4"/>
+              <w:left w:val="single" w:color="BFC7DD" w:sz="4"/>
+              <w:bottom w:val="single" w:color="BFC7DD" w:sz="4"/>
+              <w:right w:val="single" w:color="BFC7DD" w:sz="4"/>
+            </w:tcBorders>
+            <w:shd w:fill="F2F4FA" w:color="auto" w:val="clear"/>
+            <w:tcMar>
+              <w:top w:type="dxa" w:w="60"/>
+              <w:left w:type="dxa" w:w="100"/>
+              <w:bottom w:type="dxa" w:w="60"/>
+              <w:right w:type="dxa" w:w="100"/>
+            </w:tcMar>
+          </w:tcPr>
+          <w:p>
+            <w:r>
+              <w:rPr>
+                <w:rFonts w:ascii="Consolas" w:cs="Consolas" w:eastAsia="Consolas" w:hAnsi="Consolas"/>
+                <w:color w:val="212121"/>
+                <w:sz w:val="18"/>
+                <w:szCs w:val="18"/>
+              </w:rPr>
+              <w:t xml:space="preserve">SIMULAR_FALLA_UPSTREAM=error_con_clave make linea-base M=LLM02</w:t>
+            </w:r>
+          </w:p>
+        </w:tc>
+        <w:tc>
+          <w:tcPr>
+            <w:tcW w:type="dxa" w:w="3051"/>
             <w:tcBorders>
               <w:top w:val="single" w:color="BFC7DD" w:sz="4"/>
               <w:left w:val="single" w:color="BFC7DD" w:sz="4"/>
@@ -10644,10 +10548,46 @@
           <w:sz w:val="19"/>
           <w:szCs w:val="19"/>
         </w:rPr>
-        <w:t xml:space="preserve">uvicorn gateway.main:app --port 8000</w:t>
-      </w:r>
-      <w:r>
-        <w:t xml:space="preserve">.</w:t>
+        <w:t xml:space="preserve">make protegido</w:t>
+      </w:r>
+      <w:r>
+        <w:t xml:space="preserve">. Para LLM07, con la entrada todavía apagada: </w:t>
+      </w:r>
+      <w:r>
+        <w:rPr>
+          <w:rFonts w:ascii="Consolas" w:cs="Consolas" w:eastAsia="Consolas" w:hAnsi="Consolas"/>
+          <w:color w:val="8B1A1A"/>
+          <w:sz w:val="19"/>
+          <w:szCs w:val="19"/>
+        </w:rPr>
+        <w:t xml:space="preserve">MITIGACION_LLM01=false make protegido</w:t>
+      </w:r>
+      <w:r>
+        <w:t xml:space="preserve">. Para LLM02, con el mismo fallo simulado: </w:t>
+      </w:r>
+      <w:r>
+        <w:rPr>
+          <w:rFonts w:ascii="Consolas" w:cs="Consolas" w:eastAsia="Consolas" w:hAnsi="Consolas"/>
+          <w:color w:val="8B1A1A"/>
+          <w:sz w:val="19"/>
+          <w:szCs w:val="19"/>
+        </w:rPr>
+        <w:t xml:space="preserve">SIMULAR_FALLA_UPSTREAM=error_con_clave make protegido</w:t>
+      </w:r>
+      <w:r>
+        <w:t xml:space="preserve">. Detenga el gateway con </w:t>
+      </w:r>
+      <w:r>
+        <w:rPr>
+          <w:rFonts w:ascii="Consolas" w:cs="Consolas" w:eastAsia="Consolas" w:hAnsi="Consolas"/>
+          <w:color w:val="8B1A1A"/>
+          <w:sz w:val="19"/>
+          <w:szCs w:val="19"/>
+        </w:rPr>
+        <w:t xml:space="preserve">Ctrl + C</w:t>
+      </w:r>
+      <w:r>
+        <w:t xml:space="preserve"> entre un arranque y el siguiente.</w:t>
       </w:r>
     </w:p>
     <w:tbl>

</xml_diff>